<commit_message>
Humanize handout wording and add plain-language terminology
Co-Authored-By: Claude Opus 5.5 <noreply@anthropic.com>
Claude-Session: https://claude.ai/code/session_017UjdQ5UH14vGRAYTn5sNUb
</commit_message>
<xml_diff>
--- a/training/AI_for_Everyday_Business_Participant_Handout.docx
+++ b/training/AI_for_Everyday_Business_Participant_Handout.docx
@@ -66,7 +66,7 @@
         <w:spacing w:after="100" w:line="276"/>
       </w:pPr>
       <w:r>
-        <w:t xml:space="preserve">Keep this with you. It has the words we used, every prompt from the session so you can reuse them, the email example with the real AI outputs, and a one-page sheet of do’s and don’ts at the back.</w:t>
+        <w:t xml:space="preserve">This handout is yours to keep. It collects the vocabulary we used today, every prompt from the session so you can put them to work straight away, the email example with the actual AI replies, and a one-page sheet of do’s and don’ts to keep at your desk.</w:t>
       </w:r>
     </w:p>
     <w:p>
@@ -428,7 +428,7 @@
                 <w:sz w:val="18"/>
                 <w:szCs w:val="18"/>
               </w:rPr>
-              <w:t xml:space="preserve">4</w:t>
+              <w:t xml:space="preserve">5</w:t>
             </w:r>
           </w:p>
         </w:tc>
@@ -512,7 +512,7 @@
                 <w:sz w:val="18"/>
                 <w:szCs w:val="18"/>
               </w:rPr>
-              <w:t xml:space="preserve">8</w:t>
+              <w:t xml:space="preserve">9</w:t>
             </w:r>
           </w:p>
         </w:tc>
@@ -596,7 +596,7 @@
                 <w:sz w:val="18"/>
                 <w:szCs w:val="18"/>
               </w:rPr>
-              <w:t xml:space="preserve">10 (last page)</w:t>
+              <w:t xml:space="preserve">11 (last page)</w:t>
             </w:r>
           </w:p>
         </w:tc>
@@ -616,7 +616,7 @@
         <w:spacing w:after="100" w:line="276"/>
       </w:pPr>
       <w:r>
-        <w:t xml:space="preserve">The session has three stops. The third stop is done live, in real apps, with real project files.</w:t>
+        <w:t xml:space="preserve">The session is built around three stops. The first two set the foundations; the third is hands-on, using real apps and real project files from our own sites.</w:t>
       </w:r>
     </w:p>
     <w:tbl>
@@ -1354,10 +1354,10 @@
           <w:b/>
           <w:bCs/>
         </w:rPr>
-        <w:t xml:space="preserve">Context beats wording.</w:t>
-      </w:r>
-      <w:r>
-        <w:t xml:space="preserve"> Perfect phrasing doesn’t matter. Give it the background and the outcome you want.</w:t>
+        <w:t xml:space="preserve">Context matters more than wording.</w:t>
+      </w:r>
+      <w:r>
+        <w:t xml:space="preserve"> You don’t need perfect phrasing. What makes the difference is giving the AI the background and telling it the outcome you want.</w:t>
       </w:r>
     </w:p>
     <w:p>
@@ -1374,10 +1374,10 @@
           <w:b/>
           <w:bCs/>
         </w:rPr>
-        <w:t xml:space="preserve">Many routes, same result.</w:t>
-      </w:r>
-      <w:r>
-        <w:t xml:space="preserve"> Chatbot, Copilot or connector: pick one and start.</w:t>
+        <w:t xml:space="preserve">There’s more than one right way.</w:t>
+      </w:r>
+      <w:r>
+        <w:t xml:space="preserve"> A chatbot, Copilot inside Outlook or a connector will all get you there. Pick the one you’re comfortable with and start.</w:t>
       </w:r>
     </w:p>
     <w:p>
@@ -1394,10 +1394,10 @@
           <w:b/>
           <w:bCs/>
         </w:rPr>
-        <w:t xml:space="preserve">It always answers, so define “good”.</w:t>
-      </w:r>
-      <w:r>
-        <w:t xml:space="preserve"> Spell out the style and the information you need, or you’ll get something generic.</w:t>
+        <w:t xml:space="preserve">AI always gives you an answer, so tell it what “good” looks like.</w:t>
+      </w:r>
+      <w:r>
+        <w:t xml:space="preserve"> Describe the style and the information you need, otherwise the result will be generic.</w:t>
       </w:r>
     </w:p>
     <w:p>
@@ -1414,7 +1414,82 @@
         <w:spacing w:after="100" w:line="276"/>
       </w:pPr>
       <w:r>
-        <w:t xml:space="preserve">Think of an AI app as one colleague: a brain, some gadgets, access to your work apps, sitting at a desk you can talk to.</w:t>
+        <w:t xml:space="preserve">The easiest way to think about an AI app is as a new colleague: someone with a well-read mind, a set of handy tools, access to the work apps you allow, and a desk where you can talk to them.</w:t>
+      </w:r>
+    </w:p>
+    <w:p>
+      <w:pPr>
+        <w:pStyle w:val="Heading2"/>
+      </w:pPr>
+      <w:r>
+        <w:t xml:space="preserve">The basics, in plain words</w:t>
+      </w:r>
+    </w:p>
+    <w:p>
+      <w:pPr>
+        <w:spacing w:after="100" w:line="276"/>
+        <w:jc w:val="both"/>
+      </w:pPr>
+      <w:r>
+        <w:t xml:space="preserve">A few technical words come up again and again, so here they are in everyday language. A </w:t>
+      </w:r>
+      <w:r>
+        <w:rPr>
+          <w:b/>
+          <w:bCs/>
+        </w:rPr>
+        <w:t xml:space="preserve">prompt</w:t>
+      </w:r>
+      <w:r>
+        <w:t xml:space="preserve"> is simply the message you type to the AI: your question or instruction, together with any background you give it. An </w:t>
+      </w:r>
+      <w:r>
+        <w:rPr>
+          <w:b/>
+          <w:bCs/>
+        </w:rPr>
+        <w:t xml:space="preserve">LLM</w:t>
+      </w:r>
+      <w:r>
+        <w:t xml:space="preserve">, or large language model, is the engine behind tools like ChatGPT, Claude and Copilot; it has learned from an enormous amount of written text and produces its answers by predicting, piece by piece, what a helpful reply looks like. Those pieces are called </w:t>
+      </w:r>
+      <w:r>
+        <w:rPr>
+          <w:b/>
+          <w:bCs/>
+        </w:rPr>
+        <w:t xml:space="preserve">tokens</w:t>
+      </w:r>
+      <w:r>
+        <w:t xml:space="preserve">: small chunks of text, usually a whole word or part of one, and they are how an AI measures what it reads and writes, including usage limits. The </w:t>
+      </w:r>
+      <w:r>
+        <w:rPr>
+          <w:b/>
+          <w:bCs/>
+        </w:rPr>
+        <w:t xml:space="preserve">context window</w:t>
+      </w:r>
+      <w:r>
+        <w:t xml:space="preserve"> is how much the AI can keep in mind at once, measured in tokens. It holds your prompt, any files you attach and the conversation so far; when a conversation outgrows it, the AI can lose track of details from the beginning, which is why a fresh chat with a short summary often works better. Finally, </w:t>
+      </w:r>
+      <w:r>
+        <w:rPr>
+          <w:b/>
+          <w:bCs/>
+        </w:rPr>
+        <w:t xml:space="preserve">HTML</w:t>
+      </w:r>
+      <w:r>
+        <w:t xml:space="preserve"> is the language every web page is written in. It tells a browser what text, images and layout to show, and because AI has read so much of the web, it writes HTML fluently, which is why it builds better presentations as web pages than as PowerPoint files.</w:t>
+      </w:r>
+    </w:p>
+    <w:p>
+      <w:pPr>
+        <w:pStyle w:val="Heading2"/>
+      </w:pPr>
+      <w:r>
+        <w:t xml:space="preserve">The four building blocks</w:t>
       </w:r>
     </w:p>
     <w:tbl>
@@ -1578,7 +1653,7 @@
                 <w:sz w:val="18"/>
                 <w:szCs w:val="18"/>
               </w:rPr>
-              <w:t xml:space="preserve">What you know, and how you reason</w:t>
+              <w:t xml:space="preserve">What you know, and how you think things through</w:t>
             </w:r>
           </w:p>
         </w:tc>
@@ -1604,7 +1679,7 @@
                 <w:sz w:val="18"/>
                 <w:szCs w:val="18"/>
               </w:rPr>
-              <w:t xml:space="preserve">The “brain”. It has read a huge amount and can reason, write and plan. Examples: GPT (OpenAI), Claude (Anthropic), Gemini (Google).</w:t>
+              <w:t xml:space="preserve">The “brain” of the system. It has learned from a vast amount of text and can reason, write and plan. Well-known examples are GPT (OpenAI), Claude (Anthropic) and Gemini (Google).</w:t>
             </w:r>
           </w:p>
         </w:tc>
@@ -1689,7 +1764,7 @@
                 <w:sz w:val="18"/>
                 <w:szCs w:val="18"/>
               </w:rPr>
-              <w:t xml:space="preserve">Things the model uses when thinking alone isn’t enough: calculator (exact maths), web search (today’s facts), code (runs programs).</w:t>
+              <w:t xml:space="preserve">What the model reaches for when thinking alone isn’t enough: a calculator for exact maths, web search for today’s facts, and code for running calculations or building things.</w:t>
             </w:r>
           </w:p>
         </w:tc>
@@ -1748,7 +1823,7 @@
                 <w:sz w:val="18"/>
                 <w:szCs w:val="18"/>
               </w:rPr>
-              <w:t xml:space="preserve">You open Outlook, Excel, Salesforce to work</w:t>
+              <w:t xml:space="preserve">Opening Outlook, Excel or Salesforce to get work done</w:t>
             </w:r>
           </w:p>
         </w:tc>
@@ -1774,7 +1849,7 @@
                 <w:sz w:val="18"/>
                 <w:szCs w:val="18"/>
               </w:rPr>
-              <w:t xml:space="preserve">Let the AI open the same apps you use, with your permission, so it can read and act on your real data.</w:t>
+              <w:t xml:space="preserve">The link between the AI and the apps you already use. With your permission, it can read and act on your real emails, files and data.</w:t>
             </w:r>
           </w:p>
         </w:tc>
@@ -1833,7 +1908,7 @@
                 <w:sz w:val="18"/>
                 <w:szCs w:val="18"/>
               </w:rPr>
-              <w:t xml:space="preserve">The colleague at the desk</w:t>
+              <w:t xml:space="preserve">The colleague sitting at the desk</w:t>
             </w:r>
           </w:p>
         </w:tc>
@@ -1859,7 +1934,7 @@
                 <w:sz w:val="18"/>
                 <w:szCs w:val="18"/>
               </w:rPr>
-              <w:t xml:space="preserve">What you actually open and chat with: ChatGPT, Claude, Copilot. It wraps a model, its tools and its connectors into one window.</w:t>
+              <w:t xml:space="preserve">What you actually open and chat with, such as ChatGPT, Claude or Copilot. It brings the model, its tools and its connectors together in one window.</w:t>
             </w:r>
           </w:p>
         </w:tc>
@@ -1873,6 +1948,7 @@
     <w:p>
       <w:pPr>
         <w:pStyle w:val="Heading2"/>
+        <w:pageBreakBefore/>
       </w:pPr>
       <w:r>
         <w:t xml:space="preserve">More words you’ll hear</w:t>
@@ -2010,7 +2086,7 @@
                 <w:sz w:val="18"/>
                 <w:szCs w:val="18"/>
               </w:rPr>
-              <w:t xml:space="preserve">What you type to the AI. A good one says who you are, the task, what it must include, what to check, what not to do, and the style.</w:t>
+              <w:t xml:space="preserve">The message you give the AI. The best ones read like a clear brief to a colleague: who you are, the task, what must be included, what to check, what to avoid, and the tone.</w:t>
             </w:r>
           </w:p>
         </w:tc>
@@ -2069,7 +2145,7 @@
                 <w:sz w:val="18"/>
                 <w:szCs w:val="18"/>
               </w:rPr>
-              <w:t xml:space="preserve">The background the AI can’t guess: who’s who, project terms, what matters. More context beats better wording.</w:t>
+              <w:t xml:space="preserve">Everything the AI can’t guess on its own: who’s who, project terms, what matters most. More context almost always beats cleverer wording.</w:t>
             </w:r>
           </w:p>
         </w:tc>
@@ -2128,7 +2204,7 @@
                 <w:sz w:val="18"/>
                 <w:szCs w:val="18"/>
               </w:rPr>
-              <w:t xml:space="preserve">How hard the model works on an answer. Low effort is fast; high effort (or “deep research”) is slower but more thorough.</w:t>
+              <w:t xml:space="preserve">How much work the model puts into an answer. Low effort is quick; high effort, or “deep research”, takes longer but is far more thorough.</w:t>
             </w:r>
           </w:p>
         </w:tc>
@@ -2187,7 +2263,7 @@
                 <w:sz w:val="18"/>
                 <w:szCs w:val="18"/>
               </w:rPr>
-              <w:t xml:space="preserve">A tool that fetches current, public information from the internet, with links. Needed for anything after the model’s training date.</w:t>
+              <w:t xml:space="preserve">A tool that looks up current, public information online and shows you where it came from. Use it for anything that may have changed since the model was trained.</w:t>
             </w:r>
           </w:p>
         </w:tc>
@@ -2246,7 +2322,7 @@
                 <w:sz w:val="18"/>
                 <w:szCs w:val="18"/>
               </w:rPr>
-              <w:t xml:space="preserve">Your own documents given to the AI: an uploaded file, a ChatGPT Project, a Copilot Notebook, or a connector to SharePoint.</w:t>
+              <w:t xml:space="preserve">Your own documents made available to the AI, whether as an uploaded file, a ChatGPT Project, a Copilot Notebook or a connector to SharePoint.</w:t>
             </w:r>
           </w:p>
         </w:tc>
@@ -2305,7 +2381,7 @@
                 <w:sz w:val="18"/>
                 <w:szCs w:val="18"/>
               </w:rPr>
-              <w:t xml:space="preserve">A workspace where you store files and instructions once, so every new chat inside it starts with that context.</w:t>
+              <w:t xml:space="preserve">A shared workspace where you add files and instructions once, so every new conversation inside it starts with that background already in place.</w:t>
             </w:r>
           </w:p>
         </w:tc>
@@ -2364,7 +2440,7 @@
                 <w:sz w:val="18"/>
                 <w:szCs w:val="18"/>
               </w:rPr>
-              <w:t xml:space="preserve">AI built into an app you already use, e.g. Copilot in Excel or PowerPoint. It can edit your live file.</w:t>
+              <w:t xml:space="preserve">AI built into an app you already use, such as Copilot in Excel or PowerPoint. Because it works on your live file, it can make changes directly.</w:t>
             </w:r>
           </w:p>
         </w:tc>
@@ -2423,7 +2499,7 @@
                 <w:sz w:val="18"/>
                 <w:szCs w:val="18"/>
               </w:rPr>
-              <w:t xml:space="preserve">AI that carries out a multi-step task on its own (search, read, build, save), not just answer one question.</w:t>
+              <w:t xml:space="preserve">AI that works through a multi-step task on its own, such as searching, reading, building and saving, rather than answering a single question.</w:t>
             </w:r>
           </w:p>
         </w:tc>
@@ -2482,7 +2558,7 @@
                 <w:sz w:val="18"/>
                 <w:szCs w:val="18"/>
               </w:rPr>
-              <w:t xml:space="preserve">When AI states something confidently that isn’t true. Always check numbers, names, dates and citations.</w:t>
+              <w:t xml:space="preserve">When the AI states something confidently that simply isn’t true. It’s the main reason to double-check numbers, names, dates and references.</w:t>
             </w:r>
           </w:p>
         </w:tc>
@@ -2541,7 +2617,7 @@
                 <w:sz w:val="18"/>
                 <w:szCs w:val="18"/>
               </w:rPr>
-              <w:t xml:space="preserve">The point after which the model has no knowledge of its own. Use web search for anything newer.</w:t>
+              <w:t xml:space="preserve">The point up to which the model learned. It knows nothing newer unless it searches the web, so treat recent laws, rates and news with care.</w:t>
             </w:r>
           </w:p>
         </w:tc>
@@ -2600,7 +2676,7 @@
                 <w:sz w:val="18"/>
                 <w:szCs w:val="18"/>
               </w:rPr>
-              <w:t xml:space="preserve">A presentation written as a web page. AI writes HTML far better than PPTX; export a PPTX copy when someone needs to edit.</w:t>
+              <w:t xml:space="preserve">A presentation built as a web page. AI produces these far more reliably than PowerPoint files, and you can export a PPTX copy when someone needs to edit it.</w:t>
             </w:r>
           </w:p>
         </w:tc>
@@ -2624,7 +2700,7 @@
         <w:spacing w:after="100" w:line="276"/>
       </w:pPr>
       <w:r>
-        <w:t xml:space="preserve">Every model name is built from the same four parts. Each company writes them in a different order.</w:t>
+        <w:t xml:space="preserve">Model names can look like code, but every one is made of the same four parts. Each company simply puts them in a different order.</w:t>
       </w:r>
     </w:p>
     <w:tbl>
@@ -3260,7 +3336,7 @@
         <w:spacing w:after="100" w:line="276"/>
       </w:pPr>
       <w:r>
-        <w:t xml:space="preserve">We used a test email from a client asking us to pull a milestone forward, and ran a bad prompt and a good prompt through ChatGPT and Copilot. Note the trap: the email mentions an attachment that was never attached.</w:t>
+        <w:t xml:space="preserve">To see how much the prompt matters, we took a realistic client email asking us to bring a milestone forward and ran two prompts, a vague one and a detailed one, through both ChatGPT and Copilot. There’s a deliberate trap in the email: it refers to an attachment that was never actually attached.</w:t>
       </w:r>
     </w:p>
     <w:p>
@@ -6116,7 +6192,7 @@
         <w:spacing w:after="100" w:line="276"/>
       </w:pPr>
       <w:r>
-        <w:t xml:space="preserve">Every prompt from the session. Replace the words in [brackets] with your own and reuse them.</w:t>
+        <w:t xml:space="preserve">Here is every prompt from the session, grouped by topic. Swap the words in [brackets] for your own project details and they’re ready to use.</w:t>
       </w:r>
     </w:p>
     <w:p>
@@ -6388,7 +6464,7 @@
         <w:t xml:space="preserve">Tip:</w:t>
       </w:r>
       <w:r>
-        <w:t xml:space="preserve"> set the context up once in a ChatGPT Project or Copilot Notebook (project brief, who’s who, terms, past minutes), then start each week’s chat inside it.</w:t>
+        <w:t xml:space="preserve"> rather than repeating the background every week, set it up once in a ChatGPT Project or Copilot Notebook (project brief, who’s who, key terms, past minutes) and start each new chat inside it.</w:t>
       </w:r>
     </w:p>
     <w:p>
@@ -6616,7 +6692,7 @@
         <w:t xml:space="preserve">Match the effort to the job:</w:t>
       </w:r>
       <w:r>
-        <w:t xml:space="preserve"> quick questions on a fast model; everyday work on the default; full reviews on the smartest model with high effort or deep research.</w:t>
+        <w:t xml:space="preserve"> a fast model is fine for quick questions and the default is fine for everyday work, but a full contract review deserves the most capable model with high effort or deep research switched on.</w:t>
       </w:r>
     </w:p>
     <w:p>
@@ -6841,10 +6917,10 @@
           <w:b/>
           <w:bCs/>
         </w:rPr>
-        <w:t xml:space="preserve">Remember:</w:t>
-      </w:r>
-      <w:r>
-        <w:t xml:space="preserve"> a #REF! can’t be guessed. A good assistant asks which column it should point to. Save a copy before an add-in edits your live file.</w:t>
+        <w:t xml:space="preserve">Worth remembering:</w:t>
+      </w:r>
+      <w:r>
+        <w:t xml:space="preserve"> a #REF! error can’t be guessed, because the original reference no longer exists. A good assistant will ask you which column it should point to. And always save a copy before an add-in edits a live file.</w:t>
       </w:r>
     </w:p>
     <w:p>
@@ -7155,7 +7231,7 @@
         <w:spacing w:after="100" w:line="276"/>
       </w:pPr>
       <w:r>
-        <w:t xml:space="preserve">Tear this page out and keep it at your desk.</w:t>
+        <w:t xml:space="preserve">A quick reference for everyday use. Keep it somewhere you’ll see it.</w:t>
       </w:r>
     </w:p>
     <w:tbl>
@@ -7218,7 +7294,7 @@
                 <w:sz w:val="19"/>
                 <w:szCs w:val="19"/>
               </w:rPr>
-              <w:t xml:space="preserve">Give context and the outcome you want: who you are, who it’s for, what “good” looks like.</w:t>
+              <w:t xml:space="preserve">Give it context and the outcome you want: who you are, who it’s for and what “good” looks like.</w:t>
             </w:r>
           </w:p>
           <w:p>
@@ -7235,7 +7311,7 @@
                 <w:sz w:val="19"/>
                 <w:szCs w:val="19"/>
               </w:rPr>
-              <w:t xml:space="preserve">Attach the source file instead of retyping numbers.</w:t>
+              <w:t xml:space="preserve">Attach the source file rather than retyping the numbers.</w:t>
             </w:r>
           </w:p>
           <w:p>
@@ -7252,7 +7328,7 @@
                 <w:sz w:val="19"/>
                 <w:szCs w:val="19"/>
               </w:rPr>
-              <w:t xml:space="preserve">Say what NOT to do (e.g. don’t commit to dates, costs or scope).</w:t>
+              <w:t xml:space="preserve">Spell out what it should not do, for example commit to dates, costs or scope.</w:t>
             </w:r>
           </w:p>
           <w:p>
@@ -7269,7 +7345,7 @@
                 <w:sz w:val="19"/>
                 <w:szCs w:val="19"/>
               </w:rPr>
-              <w:t xml:space="preserve">Keep one chat per project, client or vendor so it remembers the history.</w:t>
+              <w:t xml:space="preserve">Keep one chat per project, client or vendor so the history stays in one place.</w:t>
             </w:r>
           </w:p>
           <w:p>
@@ -7286,7 +7362,7 @@
                 <w:sz w:val="19"/>
                 <w:szCs w:val="19"/>
               </w:rPr>
-              <w:t xml:space="preserve">Match the effort to the job: fast for quick questions, deep for reviews.</w:t>
+              <w:t xml:space="preserve">Match the effort to the task: quick for simple questions, deep for reviews.</w:t>
             </w:r>
           </w:p>
           <w:p>
@@ -7303,7 +7379,7 @@
                 <w:sz w:val="19"/>
                 <w:szCs w:val="19"/>
               </w:rPr>
-              <w:t xml:space="preserve">Turn on web search for anything recent; open every link it gives you.</w:t>
+              <w:t xml:space="preserve">Switch on web search for anything recent, and open the links it gives you.</w:t>
             </w:r>
           </w:p>
           <w:p>
@@ -7320,7 +7396,7 @@
                 <w:sz w:val="19"/>
                 <w:szCs w:val="19"/>
               </w:rPr>
-              <w:t xml:space="preserve">Ask it to flag what it’s unsure of, and to quote the clause or cell it used.</w:t>
+              <w:t xml:space="preserve">Ask it to point out what it’s unsure of, and to quote the clause or cell it relied on.</w:t>
             </w:r>
           </w:p>
           <w:p>
@@ -7354,7 +7430,7 @@
                 <w:sz w:val="19"/>
                 <w:szCs w:val="19"/>
               </w:rPr>
-              <w:t xml:space="preserve">Save a copy before an add-in edits a live file.</w:t>
+              <w:t xml:space="preserve">Save a copy of the file before an add-in makes changes to it.</w:t>
             </w:r>
           </w:p>
         </w:tc>
@@ -7398,7 +7474,7 @@
                 <w:sz w:val="19"/>
                 <w:szCs w:val="19"/>
               </w:rPr>
-              <w:t xml:space="preserve">Paste client or confidential data into tools the company hasn’t approved.</w:t>
+              <w:t xml:space="preserve">Paste client or confidential information into tools the company hasn’t approved.</w:t>
             </w:r>
           </w:p>
           <w:p>
@@ -7415,7 +7491,7 @@
                 <w:sz w:val="19"/>
                 <w:szCs w:val="19"/>
               </w:rPr>
-              <w:t xml:space="preserve">Trust numbers, names, dates or citations without checking them.</w:t>
+              <w:t xml:space="preserve">Take numbers, names, dates or references on trust without checking them.</w:t>
             </w:r>
           </w:p>
           <w:p>
@@ -7432,7 +7508,7 @@
                 <w:sz w:val="19"/>
                 <w:szCs w:val="19"/>
               </w:rPr>
-              <w:t xml:space="preserve">Let AI commit us to dates, money or scope in an email or document.</w:t>
+              <w:t xml:space="preserve">Let the AI commit us to dates, money or scope in an email or document.</w:t>
             </w:r>
           </w:p>
           <w:p>
@@ -7449,7 +7525,7 @@
                 <w:sz w:val="19"/>
                 <w:szCs w:val="19"/>
               </w:rPr>
-              <w:t xml:space="preserve">Accept a formula you can’t explain back to someone.</w:t>
+              <w:t xml:space="preserve">Use a formula you couldn’t explain to a colleague.</w:t>
             </w:r>
           </w:p>
           <w:p>
@@ -7466,7 +7542,7 @@
                 <w:sz w:val="19"/>
                 <w:szCs w:val="19"/>
               </w:rPr>
-              <w:t xml:space="preserve">Treat AI as final legal, contractual or structural advice.</w:t>
+              <w:t xml:space="preserve">Treat AI output as final legal, contractual or structural advice.</w:t>
             </w:r>
           </w:p>
           <w:p>
@@ -7483,7 +7559,7 @@
                 <w:sz w:val="19"/>
                 <w:szCs w:val="19"/>
               </w:rPr>
-              <w:t xml:space="preserve">Assume it knows recent laws, rates or news without web search.</w:t>
+              <w:t xml:space="preserve">Assume it knows about recent laws, rates or news unless it has searched for them.</w:t>
             </w:r>
           </w:p>
           <w:p>
@@ -7500,7 +7576,7 @@
                 <w:sz w:val="19"/>
                 <w:szCs w:val="19"/>
               </w:rPr>
-              <w:t xml:space="preserve">Share personal data (salaries, IDs, phone numbers) with AI tools.</w:t>
+              <w:t xml:space="preserve">Share personal data such as salaries, ID numbers or phone numbers.</w:t>
             </w:r>
           </w:p>
           <w:p>
@@ -7517,7 +7593,7 @@
                 <w:sz w:val="19"/>
                 <w:szCs w:val="19"/>
               </w:rPr>
-              <w:t xml:space="preserve">Keep one endless chat: summarise and start fresh when it gets long.</w:t>
+              <w:t xml:space="preserve">Let one chat run on forever: ask for a summary and start a fresh one.</w:t>
             </w:r>
           </w:p>
           <w:p>
@@ -7534,7 +7610,7 @@
                 <w:sz w:val="19"/>
                 <w:szCs w:val="19"/>
               </w:rPr>
-              <w:t xml:space="preserve">Forward AI output without reading it: your name is on it.</w:t>
+              <w:t xml:space="preserve">Forward AI output you haven’t read. Your name is on it.</w:t>
             </w:r>
           </w:p>
         </w:tc>
@@ -7630,7 +7706,7 @@
                 <w:sz w:val="18"/>
                 <w:szCs w:val="18"/>
               </w:rPr>
-              <w:t xml:space="preserve">Anything you paste may leave the company. Use approved tools and accounts only.</w:t>
+              <w:t xml:space="preserve">Anything you paste may leave the company. Stick to approved tools and your work account.</w:t>
             </w:r>
           </w:p>
         </w:tc>
@@ -7689,7 +7765,7 @@
                 <w:sz w:val="18"/>
                 <w:szCs w:val="18"/>
               </w:rPr>
-              <w:t xml:space="preserve">AI can sound certain and still be wrong. Verify before you rely on it.</w:t>
+              <w:t xml:space="preserve">AI can sound completely sure of itself and still be wrong. Check before you rely on it.</w:t>
             </w:r>
           </w:p>
         </w:tc>
@@ -7748,7 +7824,7 @@
                 <w:sz w:val="18"/>
                 <w:szCs w:val="18"/>
               </w:rPr>
-              <w:t xml:space="preserve">You own the output. “The AI wrote it” is never an excuse.</w:t>
+              <w:t xml:space="preserve">You own whatever you send. “The AI wrote it” is never an explanation a client will accept.</w:t>
             </w:r>
           </w:p>
         </w:tc>
@@ -7807,7 +7883,7 @@
                 <w:sz w:val="18"/>
                 <w:szCs w:val="18"/>
               </w:rPr>
-              <w:t xml:space="preserve">Models stop learning at their training date. Check what’s changed since.</w:t>
+              <w:t xml:space="preserve">Models only know what they learned up to their training date. Check what has changed since.</w:t>
             </w:r>
           </w:p>
         </w:tc>
@@ -7836,7 +7912,7 @@
           <w:sz w:val="22"/>
           <w:szCs w:val="22"/>
         </w:rPr>
-        <w:t xml:space="preserve">Context in, check out: give it everything it needs, and check everything it gives you.</w:t>
+        <w:t xml:space="preserve">Context in, check out: give it everything it needs, and check everything it gives back.</w:t>
       </w:r>
     </w:p>
     <w:sectPr>

</xml_diff>